<commit_message>
docs: neutralise leg terminology, update figures v3, and refresh submission tables
</commit_message>
<xml_diff>
--- a/3J_docs_occ_nTemp/writing/submission/extra/build_scripts/ref_submit_single.docx
+++ b/3J_docs_occ_nTemp/writing/submission/extra/build_scripts/ref_submit_single.docx
@@ -594,7 +594,7 @@
     </w:pPr>
     <w:rPr>
       <w:color w:val="000000"/>
-      <w:rFonts w:asciiTheme="majorHAnsi" w:eastAsiaTheme="majorEastAsia" w:hAnsiTheme="majorHAnsi" w:cstheme="majorBidi"/>
+      <w:rFonts w:ascii="Times New Roman" w:hAnsi="Times New Roman" w:eastAsia="Times New Roman" w:cs="Times New Roman"/>
       <w:sz w:val="56"/>
       <w:szCs w:val="56"/>
     </w:rPr>
@@ -736,7 +736,7 @@
       <w:color w:val="000000"/>
       <w:sz w:val="32"/>
       <w:szCs w:val="32"/>
-      <w:rFonts w:asciiTheme="majorHAnsi" w:eastAsiaTheme="majorEastAsia" w:hAnsiTheme="majorHAnsi" w:cstheme="majorBidi"/>
+      <w:rFonts w:ascii="Times New Roman" w:hAnsi="Times New Roman" w:eastAsia="Times New Roman" w:cs="Times New Roman"/>
       <w:sz w:val="40"/>
       <w:szCs w:val="40"/>
     </w:rPr>
@@ -761,7 +761,7 @@
       <w:color w:val="000000"/>
       <w:sz w:val="28"/>
       <w:szCs w:val="28"/>
-      <w:rFonts w:asciiTheme="majorHAnsi" w:eastAsiaTheme="majorEastAsia" w:hAnsiTheme="majorHAnsi" w:cstheme="majorBidi"/>
+      <w:rFonts w:ascii="Times New Roman" w:hAnsi="Times New Roman" w:eastAsia="Times New Roman" w:cs="Times New Roman"/>
       <w:sz w:val="32"/>
       <w:szCs w:val="32"/>
     </w:rPr>
@@ -786,7 +786,7 @@
       <w:color w:val="000000"/>
       <w:sz w:val="24"/>
       <w:szCs w:val="24"/>
-      <w:rFonts w:eastAsiaTheme="majorEastAsia" w:cstheme="majorBidi"/>
+      <w:rFonts w:ascii="Times New Roman" w:hAnsi="Times New Roman" w:eastAsia="Times New Roman" w:cs="Times New Roman"/>
       <w:sz w:val="28"/>
       <w:szCs w:val="28"/>
     </w:rPr>
@@ -1174,8 +1174,9 @@
     <w:name w:val="Verbatim Char"/>
     <w:basedOn w:val="BodyTextChar"/>
     <w:rPr>
-      <w:rFonts w:ascii="Consolas" w:hAnsi="Consolas"/>
-      <w:sz w:val="22"/>
+      <w:rFonts w:ascii="Times New Roman" w:hAnsi="Times New Roman" w:eastAsia="Times New Roman" w:cs="Times New Roman"/>
+      <w:sz w:val="24"/>
+      <w:szCs w:val="24"/>
     </w:rPr>
   </w:style>
   <w:style w:type="character" w:customStyle="1" w:styleId="SectionNumber">

</xml_diff>